<commit_message>
Updated Portfolio with CSV Processor
</commit_message>
<xml_diff>
--- a/lansangan_resume.docx
+++ b/lansangan_resume.docx
@@ -320,7 +320,31 @@
                 <w:sz w:val="18"/>
                 <w:szCs w:val="18"/>
               </w:rPr>
-              <w:t xml:space="preserve">, and data visualization using Business Intelligence tools like Excel and </w:t>
+              <w:t xml:space="preserve">, and data visualization using Business Intelligence tools like </w:t>
+            </w:r>
+            <w:r>
+              <w:rPr>
+                <w:rFonts w:ascii="Times New Roman" w:hAnsi="Times New Roman" w:cs="Times New Roman"/>
+                <w:sz w:val="18"/>
+                <w:szCs w:val="18"/>
+              </w:rPr>
+              <w:t>Tableau</w:t>
+            </w:r>
+            <w:r>
+              <w:rPr>
+                <w:rFonts w:ascii="Times New Roman" w:hAnsi="Times New Roman" w:cs="Times New Roman"/>
+                <w:sz w:val="18"/>
+                <w:szCs w:val="18"/>
+              </w:rPr>
+              <w:t xml:space="preserve">, </w:t>
+            </w:r>
+            <w:r>
+              <w:rPr>
+                <w:rFonts w:ascii="Times New Roman" w:hAnsi="Times New Roman" w:cs="Times New Roman"/>
+                <w:sz w:val="18"/>
+                <w:szCs w:val="18"/>
+              </w:rPr>
+              <w:t xml:space="preserve">Excel and </w:t>
             </w:r>
             <w:proofErr w:type="spellStart"/>
             <w:r>
@@ -899,18 +923,42 @@
                 <w:sz w:val="18"/>
                 <w:szCs w:val="18"/>
               </w:rPr>
-              <w:t xml:space="preserve">June 2022 – May 2023 | </w:t>
-            </w:r>
-            <w:proofErr w:type="spellStart"/>
-            <w:r>
-              <w:rPr>
-                <w:rFonts w:ascii="Times New Roman" w:hAnsi="Times New Roman" w:cs="Times New Roman"/>
-                <w:sz w:val="18"/>
-                <w:szCs w:val="18"/>
-              </w:rPr>
-              <w:t>FlipIt</w:t>
-            </w:r>
-            <w:proofErr w:type="spellEnd"/>
+              <w:t xml:space="preserve">June 2022 – May 2023 </w:t>
+            </w:r>
+            <w:proofErr w:type="gramStart"/>
+            <w:r>
+              <w:rPr>
+                <w:rFonts w:ascii="Times New Roman" w:hAnsi="Times New Roman" w:cs="Times New Roman"/>
+                <w:sz w:val="18"/>
+                <w:szCs w:val="18"/>
+              </w:rPr>
+              <w:t xml:space="preserve">| </w:t>
+            </w:r>
+            <w:r>
+              <w:rPr>
+                <w:rFonts w:ascii="Times New Roman" w:hAnsi="Times New Roman" w:cs="Times New Roman"/>
+                <w:sz w:val="18"/>
+                <w:szCs w:val="18"/>
+              </w:rPr>
+              <w:t xml:space="preserve"> </w:t>
+            </w:r>
+            <w:r>
+              <w:rPr>
+                <w:rFonts w:ascii="Times New Roman" w:hAnsi="Times New Roman" w:cs="Times New Roman"/>
+                <w:sz w:val="18"/>
+                <w:szCs w:val="18"/>
+              </w:rPr>
+              <w:t>Upwork</w:t>
+            </w:r>
+            <w:proofErr w:type="gramEnd"/>
+            <w:r>
+              <w:rPr>
+                <w:rFonts w:ascii="Times New Roman" w:hAnsi="Times New Roman" w:cs="Times New Roman"/>
+                <w:sz w:val="18"/>
+                <w:szCs w:val="18"/>
+              </w:rPr>
+              <w:t xml:space="preserve"> Freelance</w:t>
+            </w:r>
           </w:p>
           <w:p>
             <w:pPr>
@@ -1252,8 +1300,8 @@
               <w:jc w:val="both"/>
               <w:rPr>
                 <w:rFonts w:ascii="Times New Roman" w:hAnsi="Times New Roman" w:cs="Times New Roman"/>
-                <w:sz w:val="18"/>
-                <w:szCs w:val="18"/>
+                <w:sz w:val="6"/>
+                <w:szCs w:val="6"/>
               </w:rPr>
             </w:pPr>
             <w:r>
@@ -1268,106 +1316,7 @@
           <w:p>
             <w:pPr>
               <w:spacing w:line="360" w:lineRule="auto"/>
-              <w:ind w:left="720"/>
-              <w:jc w:val="both"/>
-              <w:rPr>
-                <w:rFonts w:ascii="Times New Roman" w:hAnsi="Times New Roman" w:cs="Times New Roman"/>
-                <w:sz w:val="18"/>
-                <w:szCs w:val="18"/>
-              </w:rPr>
-            </w:pPr>
-          </w:p>
-          <w:p>
-            <w:pPr>
-              <w:spacing w:line="360" w:lineRule="auto"/>
-              <w:jc w:val="both"/>
-              <w:rPr>
-                <w:rFonts w:ascii="Times New Roman" w:hAnsi="Times New Roman" w:cs="Times New Roman"/>
-                <w:b/>
-                <w:bCs/>
-                <w:color w:val="404040" w:themeColor="text1" w:themeTint="BF"/>
-              </w:rPr>
-            </w:pPr>
-            <w:r>
-              <w:rPr>
-                <w:rFonts w:ascii="Times New Roman" w:hAnsi="Times New Roman" w:cs="Times New Roman"/>
-                <w:b/>
-                <w:bCs/>
-                <w:color w:val="404040" w:themeColor="text1" w:themeTint="BF"/>
-              </w:rPr>
-              <w:t>Time Series Analysis and Forecast of Biomass of Tuna around West Philippine Sea</w:t>
-            </w:r>
-          </w:p>
-          <w:p>
-            <w:pPr>
-              <w:spacing w:line="360" w:lineRule="auto"/>
-              <w:jc w:val="both"/>
-              <w:rPr>
-                <w:rFonts w:ascii="Times New Roman" w:hAnsi="Times New Roman" w:cs="Times New Roman"/>
-                <w:sz w:val="18"/>
-                <w:szCs w:val="18"/>
-              </w:rPr>
-            </w:pPr>
-            <w:r>
-              <w:rPr>
-                <w:rFonts w:ascii="Times New Roman" w:hAnsi="Times New Roman" w:cs="Times New Roman"/>
-                <w:sz w:val="18"/>
-                <w:szCs w:val="18"/>
-              </w:rPr>
-              <w:t>April 2025 – Present | ASEAN Data Science Explorer</w:t>
-            </w:r>
-          </w:p>
-          <w:p>
-            <w:pPr>
-              <w:pStyle w:val="ListParagraph"/>
-              <w:numPr>
-                <w:ilvl w:val="0"/>
-                <w:numId w:val="3"/>
-              </w:numPr>
-              <w:spacing w:line="360" w:lineRule="auto"/>
-              <w:jc w:val="both"/>
-              <w:rPr>
-                <w:rFonts w:ascii="Times New Roman" w:hAnsi="Times New Roman" w:cs="Times New Roman"/>
-                <w:sz w:val="18"/>
-                <w:szCs w:val="18"/>
-              </w:rPr>
-            </w:pPr>
-            <w:r>
-              <w:rPr>
-                <w:rFonts w:ascii="Times New Roman" w:hAnsi="Times New Roman" w:cs="Times New Roman"/>
-                <w:sz w:val="18"/>
-                <w:szCs w:val="18"/>
-              </w:rPr>
-              <w:t>Developing global forecasting model to predict tuna biomass migration patterns in West Philippine Sea</w:t>
-            </w:r>
-          </w:p>
-          <w:p>
-            <w:pPr>
-              <w:pStyle w:val="ListParagraph"/>
-              <w:numPr>
-                <w:ilvl w:val="0"/>
-                <w:numId w:val="3"/>
-              </w:numPr>
-              <w:spacing w:line="360" w:lineRule="auto"/>
-              <w:jc w:val="both"/>
-              <w:rPr>
-                <w:rFonts w:ascii="Times New Roman" w:hAnsi="Times New Roman" w:cs="Times New Roman"/>
-                <w:sz w:val="18"/>
-                <w:szCs w:val="18"/>
-              </w:rPr>
-            </w:pPr>
-            <w:r>
-              <w:rPr>
-                <w:rFonts w:ascii="Times New Roman" w:hAnsi="Times New Roman" w:cs="Times New Roman"/>
-                <w:sz w:val="18"/>
-                <w:szCs w:val="18"/>
-              </w:rPr>
-              <w:t>Applying SEAPODYM framework for fisheries density forecasting in municipal fishing areas</w:t>
-            </w:r>
-          </w:p>
-          <w:p>
-            <w:pPr>
-              <w:spacing w:line="360" w:lineRule="auto"/>
+              <w:jc w:val="both"/>
               <w:rPr>
                 <w:rFonts w:ascii="Times New Roman" w:hAnsi="Times New Roman" w:cs="Times New Roman"/>
                 <w:sz w:val="6"/>
@@ -1526,7 +1475,62 @@
                 <w:sz w:val="16"/>
                 <w:szCs w:val="16"/>
               </w:rPr>
+              <w:lastRenderedPageBreak/>
               <w:t>SQL</w:t>
+            </w:r>
+          </w:p>
+          <w:p>
+            <w:pPr>
+              <w:pStyle w:val="ListParagraph"/>
+              <w:numPr>
+                <w:ilvl w:val="0"/>
+                <w:numId w:val="1"/>
+              </w:numPr>
+              <w:spacing w:line="360" w:lineRule="auto"/>
+              <w:rPr>
+                <w:rFonts w:ascii="Times New Roman" w:hAnsi="Times New Roman" w:cs="Times New Roman"/>
+                <w:sz w:val="24"/>
+                <w:szCs w:val="24"/>
+              </w:rPr>
+            </w:pPr>
+            <w:r>
+              <w:rPr>
+                <w:rFonts w:ascii="Times New Roman" w:hAnsi="Times New Roman" w:cs="Times New Roman"/>
+                <w:sz w:val="16"/>
+                <w:szCs w:val="16"/>
+              </w:rPr>
+              <w:t>PostgreSQL</w:t>
+            </w:r>
+          </w:p>
+          <w:p>
+            <w:pPr>
+              <w:pStyle w:val="ListParagraph"/>
+              <w:numPr>
+                <w:ilvl w:val="0"/>
+                <w:numId w:val="1"/>
+              </w:numPr>
+              <w:spacing w:line="360" w:lineRule="auto"/>
+              <w:rPr>
+                <w:rFonts w:ascii="Times New Roman" w:hAnsi="Times New Roman" w:cs="Times New Roman"/>
+                <w:sz w:val="24"/>
+                <w:szCs w:val="24"/>
+              </w:rPr>
+            </w:pPr>
+            <w:r>
+              <w:rPr>
+                <w:rFonts w:ascii="Times New Roman" w:hAnsi="Times New Roman" w:cs="Times New Roman"/>
+                <w:sz w:val="16"/>
+                <w:szCs w:val="16"/>
+              </w:rPr>
+              <w:t>Kotlin</w:t>
+            </w:r>
+            <w:r>
+              <w:rPr>
+                <w:rFonts w:ascii="Times New Roman" w:hAnsi="Times New Roman" w:cs="Times New Roman"/>
+                <w:sz w:val="16"/>
+                <w:szCs w:val="16"/>
+              </w:rPr>
+              <w:t xml:space="preserve"> </w:t>
             </w:r>
           </w:p>
         </w:tc>
@@ -1685,6 +1689,7 @@
                 <w:sz w:val="18"/>
                 <w:szCs w:val="18"/>
               </w:rPr>
+              <w:lastRenderedPageBreak/>
               <w:t>Data Analytics</w:t>
             </w:r>
           </w:p>
@@ -1733,6 +1738,17 @@
               </w:rPr>
               <w:t>Deep Learning (Vision)</w:t>
             </w:r>
+          </w:p>
+          <w:p>
+            <w:pPr>
+              <w:spacing w:line="360" w:lineRule="auto"/>
+              <w:ind w:left="360"/>
+              <w:rPr>
+                <w:rFonts w:ascii="Times New Roman" w:hAnsi="Times New Roman" w:cs="Times New Roman"/>
+                <w:sz w:val="18"/>
+                <w:szCs w:val="18"/>
+              </w:rPr>
+            </w:pPr>
           </w:p>
         </w:tc>
         <w:tc>
@@ -1866,6 +1882,7 @@
                 <w:sz w:val="18"/>
                 <w:szCs w:val="18"/>
               </w:rPr>
+              <w:lastRenderedPageBreak/>
               <w:t>Microsoft and Google Suites</w:t>
             </w:r>
           </w:p>
@@ -1913,6 +1930,29 @@
                 <w:szCs w:val="18"/>
               </w:rPr>
               <w:t>Time Series Analysis</w:t>
+            </w:r>
+          </w:p>
+          <w:p>
+            <w:pPr>
+              <w:pStyle w:val="ListParagraph"/>
+              <w:numPr>
+                <w:ilvl w:val="0"/>
+                <w:numId w:val="1"/>
+              </w:numPr>
+              <w:spacing w:after="160" w:line="360" w:lineRule="auto"/>
+              <w:rPr>
+                <w:rFonts w:ascii="Times New Roman" w:hAnsi="Times New Roman" w:cs="Times New Roman"/>
+                <w:sz w:val="18"/>
+                <w:szCs w:val="18"/>
+              </w:rPr>
+            </w:pPr>
+            <w:r>
+              <w:rPr>
+                <w:rFonts w:ascii="Times New Roman" w:hAnsi="Times New Roman" w:cs="Times New Roman"/>
+                <w:sz w:val="18"/>
+                <w:szCs w:val="18"/>
+              </w:rPr>
+              <w:t>Spring Boot Framework</w:t>
             </w:r>
           </w:p>
           <w:p>
@@ -1951,6 +1991,7 @@
                 <w:sz w:val="18"/>
                 <w:szCs w:val="18"/>
               </w:rPr>
+              <w:lastRenderedPageBreak/>
               <w:t xml:space="preserve"> </w:t>
             </w:r>
           </w:p>
@@ -2034,6 +2075,7 @@
                 <w:sz w:val="18"/>
                 <w:szCs w:val="18"/>
               </w:rPr>
+              <w:lastRenderedPageBreak/>
               <w:t xml:space="preserve">C1+ advanced on </w:t>
             </w:r>
             <w:hyperlink r:id="rId10" w:history="1">
@@ -2715,6 +2757,157 @@
                 <w:bCs/>
                 <w:color w:val="404040" w:themeColor="text1" w:themeTint="BF"/>
               </w:rPr>
+              <w:t>Cyber Threat Analysis (2015-2024) Dashboard</w:t>
+            </w:r>
+          </w:p>
+          <w:p>
+            <w:pPr>
+              <w:pStyle w:val="ListParagraph"/>
+              <w:numPr>
+                <w:ilvl w:val="0"/>
+                <w:numId w:val="3"/>
+              </w:numPr>
+              <w:spacing w:after="160" w:line="360" w:lineRule="auto"/>
+              <w:jc w:val="both"/>
+              <w:rPr>
+                <w:rFonts w:ascii="Times New Roman" w:hAnsi="Times New Roman" w:cs="Times New Roman"/>
+                <w:sz w:val="18"/>
+                <w:szCs w:val="18"/>
+              </w:rPr>
+            </w:pPr>
+            <w:r>
+              <w:rPr>
+                <w:rFonts w:ascii="Times New Roman" w:hAnsi="Times New Roman" w:cs="Times New Roman"/>
+                <w:sz w:val="18"/>
+                <w:szCs w:val="18"/>
+              </w:rPr>
+              <w:t xml:space="preserve">A dashboard created using </w:t>
+            </w:r>
+            <w:proofErr w:type="spellStart"/>
+            <w:r>
+              <w:rPr>
+                <w:rFonts w:ascii="Times New Roman" w:hAnsi="Times New Roman" w:cs="Times New Roman"/>
+                <w:sz w:val="18"/>
+                <w:szCs w:val="18"/>
+              </w:rPr>
+              <w:t>PowerBi</w:t>
+            </w:r>
+            <w:proofErr w:type="spellEnd"/>
+            <w:r>
+              <w:rPr>
+                <w:rFonts w:ascii="Times New Roman" w:hAnsi="Times New Roman" w:cs="Times New Roman"/>
+                <w:sz w:val="18"/>
+                <w:szCs w:val="18"/>
+              </w:rPr>
+              <w:t xml:space="preserve"> and Python to showcase key statistics of various countries recorded cyberattacks. </w:t>
+            </w:r>
+          </w:p>
+          <w:p>
+            <w:pPr>
+              <w:pStyle w:val="ListParagraph"/>
+              <w:numPr>
+                <w:ilvl w:val="0"/>
+                <w:numId w:val="3"/>
+              </w:numPr>
+              <w:spacing w:after="160" w:line="360" w:lineRule="auto"/>
+              <w:jc w:val="both"/>
+              <w:rPr>
+                <w:rFonts w:ascii="Times New Roman" w:hAnsi="Times New Roman" w:cs="Times New Roman"/>
+                <w:sz w:val="18"/>
+                <w:szCs w:val="18"/>
+              </w:rPr>
+            </w:pPr>
+            <w:r>
+              <w:rPr>
+                <w:rFonts w:ascii="Times New Roman" w:hAnsi="Times New Roman" w:cs="Times New Roman"/>
+                <w:sz w:val="18"/>
+                <w:szCs w:val="18"/>
+              </w:rPr>
+              <w:t xml:space="preserve">Skills: </w:t>
+            </w:r>
+            <w:r>
+              <w:rPr>
+                <w:rFonts w:ascii="Times New Roman" w:hAnsi="Times New Roman" w:cs="Times New Roman"/>
+                <w:sz w:val="18"/>
+                <w:szCs w:val="18"/>
+              </w:rPr>
+              <w:t xml:space="preserve">Data Visualization using </w:t>
+            </w:r>
+            <w:proofErr w:type="spellStart"/>
+            <w:r>
+              <w:rPr>
+                <w:rFonts w:ascii="Times New Roman" w:hAnsi="Times New Roman" w:cs="Times New Roman"/>
+                <w:sz w:val="18"/>
+                <w:szCs w:val="18"/>
+              </w:rPr>
+              <w:t>PowerBi</w:t>
+            </w:r>
+            <w:proofErr w:type="spellEnd"/>
+            <w:r>
+              <w:rPr>
+                <w:rFonts w:ascii="Times New Roman" w:hAnsi="Times New Roman" w:cs="Times New Roman"/>
+                <w:sz w:val="18"/>
+                <w:szCs w:val="18"/>
+              </w:rPr>
+              <w:t>.</w:t>
+            </w:r>
+          </w:p>
+          <w:p>
+            <w:pPr>
+              <w:pStyle w:val="ListParagraph"/>
+              <w:numPr>
+                <w:ilvl w:val="0"/>
+                <w:numId w:val="3"/>
+              </w:numPr>
+              <w:spacing w:after="160" w:line="360" w:lineRule="auto"/>
+              <w:jc w:val="both"/>
+              <w:rPr>
+                <w:rFonts w:ascii="Times New Roman" w:hAnsi="Times New Roman" w:cs="Times New Roman"/>
+                <w:sz w:val="18"/>
+                <w:szCs w:val="18"/>
+              </w:rPr>
+            </w:pPr>
+            <w:r>
+              <w:rPr>
+                <w:rFonts w:ascii="Times New Roman" w:hAnsi="Times New Roman" w:cs="Times New Roman"/>
+                <w:sz w:val="18"/>
+                <w:szCs w:val="18"/>
+              </w:rPr>
+              <w:t>Dashboard:</w:t>
+            </w:r>
+            <w:r>
+              <w:t xml:space="preserve"> </w:t>
+            </w:r>
+            <w:hyperlink r:id="rId14" w:history="1">
+              <w:r>
+                <w:rPr>
+                  <w:rStyle w:val="Hyperlink"/>
+                  <w:rFonts w:ascii="Times New Roman" w:hAnsi="Times New Roman" w:cs="Times New Roman"/>
+                  <w:sz w:val="18"/>
+                  <w:szCs w:val="18"/>
+                </w:rPr>
+                <w:t>https://rebrand.ly/vick9s1</w:t>
+              </w:r>
+            </w:hyperlink>
+          </w:p>
+          <w:p>
+            <w:pPr>
+              <w:spacing w:line="360" w:lineRule="auto"/>
+              <w:jc w:val="both"/>
+              <w:rPr>
+                <w:rFonts w:ascii="Times New Roman" w:hAnsi="Times New Roman" w:cs="Times New Roman"/>
+                <w:b/>
+                <w:bCs/>
+                <w:color w:val="404040" w:themeColor="text1" w:themeTint="BF"/>
+              </w:rPr>
+            </w:pPr>
+            <w:r>
+              <w:rPr>
+                <w:rFonts w:ascii="Times New Roman" w:hAnsi="Times New Roman" w:cs="Times New Roman"/>
+                <w:b/>
+                <w:bCs/>
+                <w:color w:val="404040" w:themeColor="text1" w:themeTint="BF"/>
+              </w:rPr>
               <w:t>What Makes a Great NBA Player?</w:t>
             </w:r>
           </w:p>
@@ -2818,7 +3011,7 @@
             <w:r>
               <w:t xml:space="preserve"> </w:t>
             </w:r>
-            <w:hyperlink r:id="rId14" w:history="1">
+            <w:hyperlink r:id="rId15" w:history="1">
               <w:r>
                 <w:rPr>
                   <w:rStyle w:val="Hyperlink"/>
@@ -2912,8 +3105,24 @@
                 <w:sz w:val="18"/>
                 <w:szCs w:val="18"/>
               </w:rPr>
-              <w:t xml:space="preserve">: </w:t>
-            </w:r>
+              <w:t xml:space="preserve">: WebScraping, Clustering Analysis </w:t>
+            </w:r>
+          </w:p>
+          <w:p>
+            <w:pPr>
+              <w:pStyle w:val="ListParagraph"/>
+              <w:numPr>
+                <w:ilvl w:val="0"/>
+                <w:numId w:val="3"/>
+              </w:numPr>
+              <w:spacing w:line="360" w:lineRule="auto"/>
+              <w:jc w:val="both"/>
+              <w:rPr>
+                <w:rFonts w:ascii="Times New Roman" w:hAnsi="Times New Roman" w:cs="Times New Roman"/>
+                <w:sz w:val="18"/>
+                <w:szCs w:val="18"/>
+              </w:rPr>
+            </w:pPr>
             <w:proofErr w:type="spellStart"/>
             <w:r>
               <w:rPr>
@@ -2921,7 +3130,7 @@
                 <w:sz w:val="18"/>
                 <w:szCs w:val="18"/>
               </w:rPr>
-              <w:t>WebScraping</w:t>
+              <w:t>Github</w:t>
             </w:r>
             <w:proofErr w:type="spellEnd"/>
             <w:r>
@@ -2930,40 +3139,6 @@
                 <w:sz w:val="18"/>
                 <w:szCs w:val="18"/>
               </w:rPr>
-              <w:t xml:space="preserve">, Clustering Analysis </w:t>
-            </w:r>
-          </w:p>
-          <w:p>
-            <w:pPr>
-              <w:pStyle w:val="ListParagraph"/>
-              <w:numPr>
-                <w:ilvl w:val="0"/>
-                <w:numId w:val="3"/>
-              </w:numPr>
-              <w:spacing w:line="360" w:lineRule="auto"/>
-              <w:jc w:val="both"/>
-              <w:rPr>
-                <w:rFonts w:ascii="Times New Roman" w:hAnsi="Times New Roman" w:cs="Times New Roman"/>
-                <w:sz w:val="18"/>
-                <w:szCs w:val="18"/>
-              </w:rPr>
-            </w:pPr>
-            <w:proofErr w:type="spellStart"/>
-            <w:r>
-              <w:rPr>
-                <w:rFonts w:ascii="Times New Roman" w:hAnsi="Times New Roman" w:cs="Times New Roman"/>
-                <w:sz w:val="18"/>
-                <w:szCs w:val="18"/>
-              </w:rPr>
-              <w:t>Github</w:t>
-            </w:r>
-            <w:proofErr w:type="spellEnd"/>
-            <w:r>
-              <w:rPr>
-                <w:rFonts w:ascii="Times New Roman" w:hAnsi="Times New Roman" w:cs="Times New Roman"/>
-                <w:sz w:val="18"/>
-                <w:szCs w:val="18"/>
-              </w:rPr>
               <w:t xml:space="preserve"> </w:t>
             </w:r>
             <w:proofErr w:type="gramStart"/>
@@ -3000,7 +3175,7 @@
               </w:rPr>
               <w:t xml:space="preserve"> </w:t>
             </w:r>
-            <w:hyperlink r:id="rId15" w:history="1">
+            <w:hyperlink r:id="rId16" w:history="1">
               <w:r>
                 <w:rPr>
                   <w:rStyle w:val="Hyperlink"/>
@@ -3187,7 +3362,7 @@
               </w:rPr>
               <w:t xml:space="preserve">: </w:t>
             </w:r>
-            <w:hyperlink r:id="rId16" w:history="1">
+            <w:hyperlink r:id="rId17" w:history="1">
               <w:r>
                 <w:rPr>
                   <w:rStyle w:val="Hyperlink"/>
@@ -3333,7 +3508,7 @@
               </w:rPr>
               <w:t xml:space="preserve"> Report: </w:t>
             </w:r>
-            <w:hyperlink r:id="rId17" w:history="1">
+            <w:hyperlink r:id="rId18" w:history="1">
               <w:r>
                 <w:rPr>
                   <w:rStyle w:val="Hyperlink"/>
@@ -3514,7 +3689,7 @@
             <w:r>
               <w:t xml:space="preserve"> </w:t>
             </w:r>
-            <w:hyperlink r:id="rId18" w:history="1">
+            <w:hyperlink r:id="rId19" w:history="1">
               <w:r>
                 <w:rPr>
                   <w:rStyle w:val="Hyperlink"/>
@@ -3544,7 +3719,16 @@
                 <w:bCs/>
                 <w:color w:val="404040" w:themeColor="text1" w:themeTint="BF"/>
               </w:rPr>
-              <w:t>Cyber Threat Analysis (2015-2024) Dashboard</w:t>
+              <w:t>CSV Data Processor utilizing PostgreSQL and E</w:t>
+            </w:r>
+            <w:r>
+              <w:rPr>
+                <w:rFonts w:ascii="Times New Roman" w:hAnsi="Times New Roman" w:cs="Times New Roman"/>
+                <w:b/>
+                <w:bCs/>
+                <w:color w:val="404040" w:themeColor="text1" w:themeTint="BF"/>
+              </w:rPr>
+              <w:t>lasticsearch</w:t>
             </w:r>
           </w:p>
           <w:p>
@@ -3554,6 +3738,74 @@
                 <w:ilvl w:val="0"/>
                 <w:numId w:val="3"/>
               </w:numPr>
+              <w:rPr>
+                <w:rFonts w:ascii="Times New Roman" w:hAnsi="Times New Roman" w:cs="Times New Roman"/>
+                <w:sz w:val="18"/>
+                <w:szCs w:val="18"/>
+              </w:rPr>
+            </w:pPr>
+            <w:r>
+              <w:rPr>
+                <w:rFonts w:ascii="Times New Roman" w:hAnsi="Times New Roman" w:cs="Times New Roman"/>
+                <w:sz w:val="18"/>
+                <w:szCs w:val="18"/>
+              </w:rPr>
+              <w:t>A high-performance Spring Boot application for processing and analyzing CSV sales data with dual storage</w:t>
+            </w:r>
+            <w:r>
+              <w:rPr>
+                <w:rFonts w:ascii="Times New Roman" w:hAnsi="Times New Roman" w:cs="Times New Roman"/>
+                <w:sz w:val="18"/>
+                <w:szCs w:val="18"/>
+              </w:rPr>
+              <w:t xml:space="preserve">: </w:t>
+            </w:r>
+            <w:r>
+              <w:rPr>
+                <w:rFonts w:ascii="Times New Roman" w:hAnsi="Times New Roman" w:cs="Times New Roman"/>
+                <w:sz w:val="18"/>
+                <w:szCs w:val="18"/>
+              </w:rPr>
+              <w:t>PostgreSQL for relational data and Elasticsearch for advanced search and analytics.</w:t>
+            </w:r>
+          </w:p>
+          <w:p>
+            <w:pPr>
+              <w:pStyle w:val="ListParagraph"/>
+              <w:numPr>
+                <w:ilvl w:val="0"/>
+                <w:numId w:val="3"/>
+              </w:numPr>
+              <w:rPr>
+                <w:rFonts w:ascii="Times New Roman" w:hAnsi="Times New Roman" w:cs="Times New Roman"/>
+                <w:sz w:val="18"/>
+                <w:szCs w:val="18"/>
+              </w:rPr>
+            </w:pPr>
+            <w:r>
+              <w:rPr>
+                <w:rFonts w:ascii="Times New Roman" w:hAnsi="Times New Roman" w:cs="Times New Roman"/>
+                <w:sz w:val="18"/>
+                <w:szCs w:val="18"/>
+              </w:rPr>
+              <w:t xml:space="preserve">Skills: </w:t>
+            </w:r>
+            <w:r>
+              <w:rPr>
+                <w:rFonts w:ascii="Times New Roman" w:hAnsi="Times New Roman" w:cs="Times New Roman"/>
+                <w:sz w:val="18"/>
+                <w:szCs w:val="18"/>
+              </w:rPr>
+              <w:t>Kotlin, Spring Boot, PostgreSQL</w:t>
+            </w:r>
+          </w:p>
+          <w:p>
+            <w:pPr>
+              <w:pStyle w:val="ListParagraph"/>
+              <w:numPr>
+                <w:ilvl w:val="0"/>
+                <w:numId w:val="3"/>
+              </w:numPr>
               <w:spacing w:after="160" w:line="360" w:lineRule="auto"/>
               <w:jc w:val="both"/>
               <w:rPr>
@@ -3562,14 +3814,6 @@
                 <w:szCs w:val="18"/>
               </w:rPr>
             </w:pPr>
-            <w:r>
-              <w:rPr>
-                <w:rFonts w:ascii="Times New Roman" w:hAnsi="Times New Roman" w:cs="Times New Roman"/>
-                <w:sz w:val="18"/>
-                <w:szCs w:val="18"/>
-              </w:rPr>
-              <w:t xml:space="preserve">A dashboard created using </w:t>
-            </w:r>
             <w:proofErr w:type="spellStart"/>
             <w:r>
               <w:rPr>
@@ -3577,7 +3821,7 @@
                 <w:sz w:val="18"/>
                 <w:szCs w:val="18"/>
               </w:rPr>
-              <w:t>PowerBi</w:t>
+              <w:t>Github</w:t>
             </w:r>
             <w:proofErr w:type="spellEnd"/>
             <w:r>
@@ -3586,94 +3830,17 @@
                 <w:sz w:val="18"/>
                 <w:szCs w:val="18"/>
               </w:rPr>
-              <w:t xml:space="preserve"> and Python to showcase key statistics of various countries recorded cyberattacks. </w:t>
-            </w:r>
-          </w:p>
-          <w:p>
-            <w:pPr>
-              <w:pStyle w:val="ListParagraph"/>
-              <w:numPr>
-                <w:ilvl w:val="0"/>
-                <w:numId w:val="3"/>
-              </w:numPr>
-              <w:spacing w:after="160" w:line="360" w:lineRule="auto"/>
-              <w:jc w:val="both"/>
-              <w:rPr>
-                <w:rFonts w:ascii="Times New Roman" w:hAnsi="Times New Roman" w:cs="Times New Roman"/>
-                <w:sz w:val="18"/>
-                <w:szCs w:val="18"/>
-              </w:rPr>
-            </w:pPr>
-            <w:r>
-              <w:rPr>
-                <w:rFonts w:ascii="Times New Roman" w:hAnsi="Times New Roman" w:cs="Times New Roman"/>
-                <w:sz w:val="18"/>
-                <w:szCs w:val="18"/>
-              </w:rPr>
-              <w:t xml:space="preserve">Skills: </w:t>
-            </w:r>
-            <w:r>
-              <w:rPr>
-                <w:rFonts w:ascii="Times New Roman" w:hAnsi="Times New Roman" w:cs="Times New Roman"/>
-                <w:sz w:val="18"/>
-                <w:szCs w:val="18"/>
-              </w:rPr>
-              <w:t xml:space="preserve">Data Visualization using </w:t>
-            </w:r>
-            <w:proofErr w:type="spellStart"/>
-            <w:r>
-              <w:rPr>
-                <w:rFonts w:ascii="Times New Roman" w:hAnsi="Times New Roman" w:cs="Times New Roman"/>
-                <w:sz w:val="18"/>
-                <w:szCs w:val="18"/>
-              </w:rPr>
-              <w:t>PowerBi</w:t>
-            </w:r>
-            <w:proofErr w:type="spellEnd"/>
-            <w:r>
-              <w:rPr>
-                <w:rFonts w:ascii="Times New Roman" w:hAnsi="Times New Roman" w:cs="Times New Roman"/>
-                <w:sz w:val="18"/>
-                <w:szCs w:val="18"/>
-              </w:rPr>
-              <w:t>.</w:t>
-            </w:r>
-          </w:p>
-          <w:p>
-            <w:pPr>
-              <w:pStyle w:val="ListParagraph"/>
-              <w:numPr>
-                <w:ilvl w:val="0"/>
-                <w:numId w:val="3"/>
-              </w:numPr>
-              <w:spacing w:after="160" w:line="360" w:lineRule="auto"/>
-              <w:jc w:val="both"/>
-              <w:rPr>
-                <w:rFonts w:ascii="Times New Roman" w:hAnsi="Times New Roman" w:cs="Times New Roman"/>
-                <w:sz w:val="18"/>
-                <w:szCs w:val="18"/>
-              </w:rPr>
-            </w:pPr>
-            <w:r>
-              <w:rPr>
-                <w:rFonts w:ascii="Times New Roman" w:hAnsi="Times New Roman" w:cs="Times New Roman"/>
-                <w:sz w:val="18"/>
-                <w:szCs w:val="18"/>
-              </w:rPr>
-              <w:t>Dashboard</w:t>
-            </w:r>
-            <w:r>
-              <w:rPr>
-                <w:rFonts w:ascii="Times New Roman" w:hAnsi="Times New Roman" w:cs="Times New Roman"/>
-                <w:sz w:val="18"/>
-                <w:szCs w:val="18"/>
-              </w:rPr>
-              <w:t>:</w:t>
-            </w:r>
-            <w:r>
-              <w:t xml:space="preserve"> </w:t>
-            </w:r>
-            <w:hyperlink r:id="rId19" w:history="1">
+              <w:t xml:space="preserve"> Report</w:t>
+            </w:r>
+            <w:r>
+              <w:rPr>
+                <w:rFonts w:ascii="Times New Roman" w:hAnsi="Times New Roman" w:cs="Times New Roman"/>
+                <w:sz w:val="18"/>
+                <w:szCs w:val="18"/>
+              </w:rPr>
+              <w:t xml:space="preserve">: </w:t>
+            </w:r>
+            <w:hyperlink r:id="rId20" w:history="1">
               <w:r>
                 <w:rPr>
                   <w:rStyle w:val="Hyperlink"/>
@@ -3681,7 +3848,7 @@
                   <w:sz w:val="18"/>
                   <w:szCs w:val="18"/>
                 </w:rPr>
-                <w:t>https://rebrand.ly/vick9s1</w:t>
+                <w:t>https://rebrand.ly/25vslnw</w:t>
               </w:r>
             </w:hyperlink>
           </w:p>
@@ -4508,7 +4675,7 @@
   <w:style w:type="paragraph" w:default="1" w:styleId="Normal">
     <w:name w:val="Normal"/>
     <w:qFormat/>
-    <w:rsid w:val="00294535"/>
+    <w:rsid w:val="001968F4"/>
   </w:style>
   <w:style w:type="paragraph" w:styleId="Heading1">
     <w:name w:val="heading 1"/>

</xml_diff>